<commit_message>
Confirm published project URL in proposal and README
</commit_message>
<xml_diff>
--- a/proposal/PerDrobe_CMPE491_Project_Proposal.docx
+++ b/proposal/PerDrobe_CMPE491_Project_Proposal.docx
@@ -166,9 +166,9 @@
     </w:p>
     <w:p>
       <w:r>
-        <w:t>Planned project website: https://beratergun.github.io/perdrobe/</w:t>
+        <w:t>Project website: https://beratergun.github.io/perdrobe/</w:t>
         <w:br/>
-        <w:t>This is the intended GitHub Pages location; deployment has not been confirmed.</w:t>
+        <w:t>The academic project page hosts the proposal and will be updated throughout CMPE 491 and CMPE 492.</w:t>
       </w:r>
     </w:p>
     <w:p>

</xml_diff>